<commit_message>
Consolida encerramento das etapas 11 e 12 no Roadmap
</commit_message>
<xml_diff>
--- a/Roadmap Técnico do Tamo Junto Games.docx
+++ b/Roadmap Técnico do Tamo Junto Games.docx
@@ -48,7 +48,7 @@
           <w:bCs/>
           <w:color w:val="2E74B5"/>
         </w:rPr>
-        <w:t>10 de 12 etapas concluídas  |  2 etapas pendentes</w:t>
+        <w:t xml:space="preserve">12 de 12 etapas concluídas  |  Nenhuma etapa pendente no ciclo atual</w:t>
       </w:r>
     </w:p>
     <w:p>
@@ -64,7 +64,7 @@
           <w:sz w:val="18"/>
           <w:szCs w:val="18"/>
         </w:rPr>
-        <w:t>Suíte atual: 127 testes aprovados. Próxima etapa: 11 — Paginar e otimizar consultas.</w:t>
+        <w:t xml:space="preserve">Validação final: 166 testes aprovados, zero falhas e zero ignorados. Projeto pronto para stand-by.</w:t>
       </w:r>
     </w:p>
     <w:p>
@@ -78,7 +78,7 @@
           <w:sz w:val="19"/>
           <w:szCs w:val="19"/>
         </w:rPr>
-        <w:t>Versão 1.2  •  18 de outubro de 2026</w:t>
+        <w:t xml:space="preserve">Versão 1.3  •  19 de outubro de 2026</w:t>
       </w:r>
     </w:p>
     <w:p>
@@ -117,10 +117,10 @@
         <w:spacing w:after="140"/>
       </w:pPr>
       <w:r>
-        <w:t>Este roadmap reúne, em ordem recomendada, as melhorias técnicas definidas para o módulo de usuários e autenticação. A sequência prioriza segurança contra regressões, correção de</w:t>
-      </w:r>
-      <w:r>
-        <w:t xml:space="preserve"> inconsistências funcionais, integridade dos dados e evolução gradual da arquitetura.</w:t>
+        <w:t xml:space="preserve">Este roadmap reúne, em ordem recomendada, as melhorias técnicas definidas para o módulo de usuários e autenticação. A sequência prioriza segurança contra regressões, correção de inconsistências funcionais, integridade dos dados e evolução gradual da arquitetura. As 12 etapas estão concluídas nos escopos aprovados. O ciclo técnico está encerrado e o projeto está pronto para stand-by; publicação em produção continua dependente de decisões, implementações condicionais e homologação futura.</w:t>
+      </w:r>
+      <w:r>
+        <w:t xml:space="preserve"/>
       </w:r>
     </w:p>
     <w:p>
@@ -1205,14 +1205,14 @@
                 <w:sz w:val="19"/>
                 <w:szCs w:val="19"/>
               </w:rPr>
-              <w:t>Paginar e otimizar consultas</w:t>
+              <w:t xml:space="preserve">Otimizar a consulta individual de usuário</w:t>
             </w:r>
           </w:p>
         </w:tc>
         <w:tc>
           <w:tcPr>
             <w:tcW w:w="1580" w:type="dxa"/>
-            <w:shd w:val="clear" w:color="auto" w:fill="FFF4D6"/>
+            <w:shd w:val="clear" w:color="auto" w:fill="EAF5ED"/>
             <w:tcMar>
               <w:top w:w="90" w:type="dxa"/>
               <w:left w:w="120" w:type="dxa"/>
@@ -1223,7 +1223,7 @@
           </w:tcPr>
           <w:p>
             <w:r>
-              <w:t>Pendente</w:t>
+              <w:t xml:space="preserve">Concluída</w:t>
             </w:r>
           </w:p>
         </w:tc>
@@ -1286,14 +1286,14 @@
                 <w:sz w:val="19"/>
                 <w:szCs w:val="19"/>
               </w:rPr>
-              <w:t>Preparar a API para produção</w:t>
+              <w:t xml:space="preserve">Preparar a API para produção (escopo preparatório)</w:t>
             </w:r>
           </w:p>
         </w:tc>
         <w:tc>
           <w:tcPr>
             <w:tcW w:w="1580" w:type="dxa"/>
-            <w:shd w:val="clear" w:color="auto" w:fill="FFF4D6"/>
+            <w:shd w:val="clear" w:color="auto" w:fill="EAF5ED"/>
             <w:tcMar>
               <w:top w:w="90" w:type="dxa"/>
               <w:left w:w="120" w:type="dxa"/>
@@ -1304,7 +1304,7 @@
           </w:tcPr>
           <w:p>
             <w:r>
-              <w:t>Pendente</w:t>
+              <w:t xml:space="preserve">Concluída</w:t>
             </w:r>
           </w:p>
         </w:tc>
@@ -1330,6 +1330,7 @@
     </w:p>
     <w:p>
       <w:pPr>
+        <w:keepNext/>
         <w:keepLines/>
         <w:spacing w:after="100" w:line="280" w:lineRule="auto"/>
       </w:pPr>
@@ -1417,6 +1418,7 @@
     </w:p>
     <w:p>
       <w:pPr>
+        <w:keepNext/>
         <w:keepLines/>
         <w:spacing w:after="100" w:line="280" w:lineRule="auto"/>
       </w:pPr>
@@ -1512,6 +1514,7 @@
     </w:p>
     <w:p>
       <w:pPr>
+        <w:keepNext/>
         <w:keepLines/>
         <w:spacing w:after="100" w:line="280" w:lineRule="auto"/>
       </w:pPr>
@@ -1602,6 +1605,7 @@
     </w:p>
     <w:p>
       <w:pPr>
+        <w:keepNext/>
         <w:keepLines/>
         <w:spacing w:after="100" w:line="280" w:lineRule="auto"/>
       </w:pPr>
@@ -1693,6 +1697,7 @@
     </w:p>
     <w:p>
       <w:pPr>
+        <w:keepNext/>
         <w:keepLines/>
         <w:spacing w:after="100" w:line="280" w:lineRule="auto"/>
       </w:pPr>
@@ -1785,6 +1790,7 @@
     </w:p>
     <w:p>
       <w:pPr>
+        <w:keepNext/>
         <w:keepLines/>
         <w:spacing w:after="100" w:line="280" w:lineRule="auto"/>
       </w:pPr>
@@ -1935,6 +1941,7 @@
     </w:p>
     <w:p>
       <w:pPr>
+        <w:keepNext/>
         <w:keepLines/>
         <w:spacing w:after="100" w:line="280" w:lineRule="auto"/>
       </w:pPr>
@@ -2085,6 +2092,7 @@
     </w:p>
     <w:p>
       <w:pPr>
+        <w:keepNext/>
         <w:keepLines/>
         <w:spacing w:after="100" w:line="280" w:lineRule="auto"/>
       </w:pPr>
@@ -2239,6 +2247,7 @@
     </w:p>
     <w:p>
       <w:pPr>
+        <w:keepNext/>
         <w:keepLines/>
         <w:spacing w:after="100" w:line="280" w:lineRule="auto"/>
       </w:pPr>
@@ -2455,6 +2464,7 @@
     </w:p>
     <w:p>
       <w:pPr>
+        <w:keepNext/>
         <w:keepLines/>
         <w:spacing w:after="100" w:line="280" w:lineRule="auto"/>
       </w:pPr>
@@ -2684,11 +2694,12 @@
         <w:pStyle w:val="Ttulo2"/>
       </w:pPr>
       <w:r>
-        <w:t>Etapa 11 — Paginar e otimizar consultas</w:t>
-      </w:r>
-    </w:p>
-    <w:p>
-      <w:pPr>
+        <w:t xml:space="preserve">Etapa 11 — Otimizar a consulta individual de usuário</w:t>
+      </w:r>
+    </w:p>
+    <w:p>
+      <w:pPr>
+        <w:keepNext/>
         <w:keepLines/>
         <w:spacing w:after="100" w:line="280" w:lineRule="auto"/>
       </w:pPr>
@@ -2707,35 +2718,27 @@
         <w:rPr>
           <w:b/>
           <w:bCs/>
-          <w:color w:val="8A5A00"/>
+          <w:color w:val="1B7D3A"/>
           <w:sz w:val="19"/>
           <w:szCs w:val="19"/>
         </w:rPr>
-        <w:t>PENDENTE</w:t>
-      </w:r>
-    </w:p>
-    <w:p>
-      <w:pPr>
-        <w:keepLines/>
-      </w:pPr>
-      <w:r>
-        <w:rPr>
-          <w:b/>
-          <w:bCs/>
-          <w:color w:val="17365D"/>
-        </w:rPr>
-        <w:t>Obj</w:t>
-      </w:r>
-      <w:r>
-        <w:rPr>
-          <w:b/>
-          <w:bCs/>
-          <w:color w:val="17365D"/>
-        </w:rPr>
-        <w:t xml:space="preserve">etivo. </w:t>
-      </w:r>
-      <w:r>
-        <w:t>Manter tempo de resposta e consumo de memória estáveis conforme o número de usuários crescer.</w:t>
+        <w:t>CONCLUÍDA</w:t>
+      </w:r>
+    </w:p>
+    <w:p>
+      <w:pPr>
+        <w:keepLines/>
+      </w:pPr>
+      <w:r>
+        <w:rPr>
+          <w:b/>
+          <w:bCs/>
+          <w:color w:val="17365D"/>
+        </w:rPr>
+        <w:t xml:space="preserve">Objetivo. </w:t>
+      </w:r>
+      <w:r>
+        <w:t>Reduzir os dados transferidos e evitar materialização desnecessária na consulta individual de usuário, preservando autorização e contrato público.</w:t>
       </w:r>
     </w:p>
     <w:p>
@@ -2751,7 +2754,7 @@
         <w:t xml:space="preserve">Principais arquivos. </w:t>
       </w:r>
       <w:r>
-        <w:t>Controllers/UsuariosController.cs; Services/IUsuarioService.cs; Services/UsuarioService.cs; novos DTOs de paginação; configuração do banco; testes.</w:t>
+        <w:t>TamoJuntoGames.API/Services/UsuarioService.cs; TamoJuntoGames.API.Tests/UsuariosAuthenticationTests.cs; TamoJuntoGames.API.Tests/UsuariosQueryProjectionTests.cs.</w:t>
       </w:r>
     </w:p>
     <w:p>
@@ -2765,10 +2768,42 @@
           <w:bCs/>
           <w:color w:val="17365D"/>
         </w:rPr>
-        <w:t xml:space="preserve">Escopo planejado. </w:t>
-      </w:r>
-      <w:r>
-        <w:t>Paginar listagens, projetar DTOs no banco e estabelecer limites máximos por página.</w:t>
+        <w:t xml:space="preserve">Escopo original e readequação. </w:t>
+      </w:r>
+      <w:r>
+        <w:t>O planejamento previa paginar listagens, projetar DTOs no banco e limitar itens por página. Como a listagem geral foi removida na Etapa 5 por privacidade, o escopo aprovado passou a ser a otimização de ObterPorIdAsync. Paginação não foi implementada, e reintroduzir a listagem não é uma pendência obrigatória.</w:t>
+      </w:r>
+    </w:p>
+    <w:p>
+      <w:pPr>
+        <w:keepLines/>
+      </w:pPr>
+      <w:r>
+        <w:rPr>
+          <w:b/>
+          <w:bCs/>
+          <w:color w:val="17365D"/>
+        </w:rPr>
+        <w:t xml:space="preserve">Resultado atual. </w:t>
+      </w:r>
+      <w:r>
+        <w:t>Consulta por ID com filtro e Select traduzidos pelo EF Core/SQLite, antes de FirstOrDefaultAsync. Apenas Id, NomeCompleto, Apelido e Email são projetados para UsuarioRespostaDTO; a entidade Usuario completa não é materializada. AsNoTracking, execução assíncrona, retorno null e contratos HTTP foram preservados.</w:t>
+      </w:r>
+    </w:p>
+    <w:p>
+      <w:pPr>
+        <w:keepLines/>
+      </w:pPr>
+      <w:r>
+        <w:rPr>
+          <w:b/>
+          <w:bCs/>
+          <w:color w:val="17365D"/>
+        </w:rPr>
+        <w:t xml:space="preserve">Cobertura automatizada. </w:t>
+      </w:r>
+      <w:r>
+        <w:t>Teste de projeção executa a consulta contra SQLite em memória, inspeciona as colunas selecionadas e verifica ausência de materialização de Usuario. O teste do contrato JSON também foi fortalecido. Resultado histórico da etapa: 128 testes aprovados, zero falhas e zero ignorados.</w:t>
       </w:r>
     </w:p>
     <w:p>
@@ -2782,6 +2817,7 @@
     </w:p>
     <w:p>
       <w:pPr>
+        <w:keepNext/>
         <w:keepLines/>
         <w:spacing w:after="100" w:line="280" w:lineRule="auto"/>
       </w:pPr>
@@ -2800,11 +2836,11 @@
         <w:rPr>
           <w:b/>
           <w:bCs/>
-          <w:color w:val="8A5A00"/>
+          <w:color w:val="1B7D3A"/>
           <w:sz w:val="19"/>
           <w:szCs w:val="19"/>
         </w:rPr>
-        <w:t>PENDENTE</w:t>
+        <w:t>CONCLUÍDA NO ESCOPO PREPARATÓRIO</w:t>
       </w:r>
     </w:p>
     <w:p>
@@ -2820,7 +2856,7 @@
         <w:t xml:space="preserve">Objetivo. </w:t>
       </w:r>
       <w:r>
-        <w:t>Evoluir infraestrutura e operação somente quando existir um ambiente real de publicação e escala.</w:t>
+        <w:t>Concluir o ciclo preparatório e documental aprovado, registrar riscos e requisitos de publicação e permitir uma retomada informada, sem antecipar escolhas de infraestrutura.</w:t>
       </w:r>
     </w:p>
     <w:p>
@@ -2836,10 +2872,7 @@
         <w:t xml:space="preserve">Principais arquivos. </w:t>
       </w:r>
       <w:r>
-        <w:t>Program.cs; TamoJuntoGames.API.csproj; appsettings e variáveis de ambi</w:t>
-      </w:r>
-      <w:r>
-        <w:t>ente; AppDbContext e migrations; arquivos de implantação e documentação.</w:t>
+        <w:t>TamoJuntoGames.API/Program.cs; JwtLoggingTests.cs; HistoricalEmailMigrationTests.cs; EmailIdentityDiagnosticTests.cs; Infrastructure/HistoricalEmailDatabase.cs (no projeto de testes); tools/EmailIdentityDiagnostic; README.md; docs/diagnostico-identidade-email.md; docs/plano-publicacao-retomada.md.</w:t>
       </w:r>
     </w:p>
     <w:p>
@@ -2853,10 +2886,198 @@
           <w:bCs/>
           <w:color w:val="17365D"/>
         </w:rPr>
-        <w:t xml:space="preserve">Escopo planejado. </w:t>
-      </w:r>
-      <w:r>
-        <w:t>Planejar banco servidor, migrations controladas, refresh/revogação, rotação de chaves, CORS, HTTPS/proxy e observabilidade em entregas independentes.</w:t>
+        <w:t xml:space="preserve">Escopo original e readequação. </w:t>
+      </w:r>
+      <w:r>
+        <w:t>O planejamento previa avaliar banco servidor, migrations controladas, refresh/revogação, rotação de chaves, CORS, HTTPS/proxy e observabilidade em entregas independentes. O escopo executado nesta etapa foi preparatório: logging JWT, caracterização de identidades legadas, documentação da API e plano de publicação e retomada. As implementações de produção continuam condicionadas ao cenário futuro.</w:t>
+      </w:r>
+    </w:p>
+    <w:p>
+      <w:pPr>
+        <w:keepLines/>
+      </w:pPr>
+      <w:r>
+        <w:rPr>
+          <w:b/>
+          <w:bCs/>
+          <w:color w:val="17365D"/>
+        </w:rPr>
+        <w:t xml:space="preserve">12.1 — Logging de autenticação JWT. </w:t>
+      </w:r>
+      <w:r>
+        <w:t>Console.WriteLine dos callbacks personalizados substituídos por logs estruturados e sanitizados, com níveis e eventos controlados e cobertura automatizada. A alteração não comprova sanitização integral dos logs internos do framework ou da hospedagem.</w:t>
+      </w:r>
+    </w:p>
+    <w:p>
+      <w:pPr>
+        <w:keepLines/>
+      </w:pPr>
+      <w:r>
+        <w:rPr>
+          <w:b/>
+          <w:bCs/>
+          <w:color w:val="17365D"/>
+        </w:rPr>
+        <w:t xml:space="preserve">12.2 — Identidades de e-mails legadas. </w:t>
+      </w:r>
+      <w:r>
+        <w:t>Testes históricos de normalização e migrations reproduziram com dados sintéticos a divergência entre upper(trim(Email)) do SQLite e Trim().ToUpperInvariant() do normalizador C#. A caracterização não altera a migration histórica nem corrige identidades existentes.</w:t>
+      </w:r>
+    </w:p>
+    <w:p>
+      <w:pPr>
+        <w:keepLines/>
+      </w:pPr>
+      <w:r>
+        <w:rPr>
+          <w:b/>
+          <w:bCs/>
+          <w:color w:val="17365D"/>
+        </w:rPr>
+        <w:t xml:space="preserve">Diagnóstico e limites. </w:t>
+      </w:r>
+      <w:r>
+        <w:t>Ferramenta tools/EmailIdentityDiagnostic e documentação específica concluídas. O diagnóstico é somente leitura e exige cópia autorizada, consistente, offline e independente, respeitando as restrições de WAL/journals documentadas. Não realiza reparos. Nenhum reparo ou diagnóstico foi realizado no banco real; a existência de registros reais afetados permanece desconhecida.</w:t>
+      </w:r>
+    </w:p>
+    <w:p>
+      <w:pPr>
+        <w:keepLines/>
+      </w:pPr>
+      <w:r>
+        <w:rPr>
+          <w:b/>
+          <w:bCs/>
+          <w:color w:val="17365D"/>
+        </w:rPr>
+        <w:t xml:space="preserve">12.3 — README. </w:t>
+      </w:r>
+      <w:r>
+        <w:t>README.md existente atualizado com funcionalidades implementadas, endpoints, autenticação e autorização, configuração local, execução, testes e limitações. A documentação distingue a API atual das funcionalidades planejadas e não anuncia homologação para produção.</w:t>
+      </w:r>
+    </w:p>
+    <w:p>
+      <w:pPr>
+        <w:keepLines/>
+      </w:pPr>
+      <w:r>
+        <w:rPr>
+          <w:b/>
+          <w:bCs/>
+          <w:color w:val="17365D"/>
+        </w:rPr>
+        <w:t xml:space="preserve">12.4 — Publicação e retomada. </w:t>
+      </w:r>
+      <w:r>
+        <w:t>docs/plano-publicacao-retomada.md registra requisitos P0/P1/P2 contextualizados, riscos conhecidos e suas condições de ocorrência, decisões abertas, estratégia de retomada e critérios de futura homologação. As evidências do SQLite nativo correspondem ao artefato local examinado; não comprovam corrupção do banco real nem determinam a biblioteca de uma implantação futura.</w:t>
+      </w:r>
+    </w:p>
+    <w:p>
+      <w:pPr>
+        <w:keepLines/>
+      </w:pPr>
+      <w:r>
+        <w:rPr>
+          <w:b/>
+          <w:bCs/>
+          <w:color w:val="17365D"/>
+        </w:rPr>
+        <w:t xml:space="preserve">Limite da conclusão. </w:t>
+      </w:r>
+      <w:r>
+        <w:t>A conclusão da Etapa 12 representa a conclusão do ciclo preparatório e documental aprovado. Não significa que a API esteja implantada, homologada ou autorizada para produção.</w:t>
+      </w:r>
+    </w:p>
+    <w:p>
+      <w:pPr>
+        <w:pStyle w:val="Ttulo1"/>
+        <w:spacing w:after="120"/>
+      </w:pPr>
+      <w:r>
+        <w:t xml:space="preserve">Encerramento e retomada</w:t>
+      </w:r>
+      <w:r>
+        <w:t/>
+      </w:r>
+    </w:p>
+    <w:p>
+      <w:pPr>
+        <w:keepLines/>
+      </w:pPr>
+      <w:r>
+        <w:rPr>
+          <w:b/>
+          <w:bCs/>
+          <w:color w:val="17365D"/>
+        </w:rPr>
+        <w:t xml:space="preserve">Status geral. </w:t>
+      </w:r>
+      <w:r>
+        <w:t>Etapas 1 a 12 concluídas nos respectivos escopos aprovados; nenhuma etapa pendente dentro do ciclo técnico atual. Projeto pronto para stand-by. A conclusão não declara implementados os requisitos condicionais de uma futura publicação.</w:t>
+      </w:r>
+    </w:p>
+    <w:p>
+      <w:pPr>
+        <w:keepLines/>
+      </w:pPr>
+      <w:r>
+        <w:rPr>
+          <w:b/>
+          <w:bCs/>
+          <w:color w:val="17365D"/>
+        </w:rPr>
+        <w:t xml:space="preserve">Validação técnica final. </w:t>
+      </w:r>
+      <w:r>
+        <w:t>Build da solução concluído com zero erros e zero warnings. Suíte completa: 166 testes aprovados, zero falhas e zero ignorados, em ambientes sintéticos. Referências a quantidades menores nas etapas anteriores são registros históricos.</w:t>
+      </w:r>
+    </w:p>
+    <w:p>
+      <w:pPr>
+        <w:keepLines/>
+      </w:pPr>
+      <w:r>
+        <w:rPr>
+          <w:b/>
+          <w:bCs/>
+          <w:color w:val="17365D"/>
+        </w:rPr>
+        <w:t xml:space="preserve">Rastreabilidade. </w:t>
+      </w:r>
+      <w:r>
+        <w:t>Validação final realizada na branch main, com Git limpo antes desta atualização documental. Commit de referência: f92bb24b353c6ec54024dc176d5ac4b19148fd25. O encerramento não incluiu deploy, migrations ou diagnóstico no banco real, nem acesso aos User Secrets locais.</w:t>
+      </w:r>
+    </w:p>
+    <w:p>
+      <w:pPr>
+        <w:keepLines/>
+      </w:pPr>
+      <w:r>
+        <w:rPr>
+          <w:b/>
+          <w:bCs/>
+          <w:color w:val="17365D"/>
+        </w:rPr>
+        <w:t xml:space="preserve">Próximo passo futuro. </w:t>
+      </w:r>
+      <w:r>
+        <w:t>Na retomada, revisar o estado do projeto e definir o objetivo da próxima fase antes de implementar. Se o objetivo for publicar a API, começar por docs/plano-publicacao-retomada.md e revalidar riscos, dependências e requisitos conforme o ambiente escolhido. Hospedagem, banco servidor, Docker e outras tecnologias não estão definidos antecipadamente.</w:t>
+      </w:r>
+    </w:p>
+    <w:p>
+      <w:pPr>
+        <w:keepLines/>
+      </w:pPr>
+      <w:r>
+        <w:rPr>
+          <w:b/>
+          <w:bCs/>
+          <w:color w:val="17365D"/>
+        </w:rPr>
+        <w:t xml:space="preserve">Referências existentes. </w:t>
+      </w:r>
+      <w:r>
+        <w:t>README.md: funcionamento e desenvolvimento local; docs/diagnostico-identidade-email.md: procedimento e limites do diagnóstico legado; docs/plano-publicacao-retomada.md: prioridades, riscos, decisões e critérios de publicação.</w:t>
       </w:r>
     </w:p>
     <w:p>

</xml_diff>